<commit_message>
add Google verification file
</commit_message>
<xml_diff>
--- a/更新方法.docx
+++ b/更新方法.docx
@@ -27,11 +27,27 @@
         <w:t>cd /d E:\personalsite</w:t>
       </w:r>
     </w:p>
-    <w:p/>
     <w:p>
       <w:r>
-        <w:t>git add .</w:t>
+        <w:t xml:space="preserve">python3 jemdoc.py </w:t>
       </w:r>
+      <w:proofErr w:type="spellStart"/>
+      <w:proofErr w:type="gramStart"/>
+      <w:r>
+        <w:t>index.jemdoc</w:t>
+      </w:r>
+      <w:proofErr w:type="spellEnd"/>
+      <w:proofErr w:type="gramEnd"/>
+    </w:p>
+    <w:p>
+      <w:r>
+        <w:t xml:space="preserve">git </w:t>
+      </w:r>
+      <w:proofErr w:type="gramStart"/>
+      <w:r>
+        <w:t>add .</w:t>
+      </w:r>
+      <w:proofErr w:type="gramEnd"/>
     </w:p>
     <w:p>
       <w:r>
@@ -695,6 +711,7 @@
   <w:style w:type="character" w:default="1" w:styleId="a0">
     <w:name w:val="Default Paragraph Font"/>
     <w:uiPriority w:val="1"/>
+    <w:semiHidden/>
     <w:unhideWhenUsed/>
   </w:style>
   <w:style w:type="table" w:default="1" w:styleId="a1">

</xml_diff>